<commit_message>
feat: tela de esqueci minha senha + link no login + atualização docs user stories
Adiciona ForgotPasswordPage com validação de email, integração com
endpoint /auth/forgot-password e feedback visual. Link "Esqueci minha
senha" no LoginPage. Atualiza documentação de user stories das fases 2-5.

Co-Authored-By: Claude Opus 4.6 <noreply@anthropic.com>
</commit_message>
<xml_diff>
--- a/protos-farm-documentation-small/ProtosFarm_Fase3_Compras_UserStories.docx
+++ b/protos-farm-documentation-small/ProtosFarm_Fase3_Compras_UserStories.docx
@@ -2324,62 +2324,7 @@
                 <w:sz w:val="17"/>
                 <w:szCs w:val="17"/>
               </w:rPr>
-              <w:t xml:space="preserve">Como </w:t>
-            </w:r>
-            <w:r>
-              <w:rPr>
-                <w:rFonts w:ascii="Arial" w:cs="Arial" w:eastAsia="Arial" w:hAnsi="Arial"/>
-                <w:i/>
-                <w:iCs/>
-                <w:color w:val="1A1A1A"/>
-                <w:sz w:val="17"/>
-                <w:szCs w:val="17"/>
-              </w:rPr>
-              <w:t xml:space="preserve">gerente administrativo</w:t>
-            </w:r>
-            <w:r>
-              <w:rPr>
-                <w:rFonts w:ascii="Arial" w:cs="Arial" w:eastAsia="Arial" w:hAnsi="Arial"/>
-                <w:i/>
-                <w:iCs/>
-                <w:color w:val="1A1A1A"/>
-                <w:sz w:val="17"/>
-                <w:szCs w:val="17"/>
-              </w:rPr>
-              <w:t xml:space="preserve">, quero </w:t>
-            </w:r>
-            <w:r>
-              <w:rPr>
-                <w:rFonts w:ascii="Arial" w:cs="Arial" w:eastAsia="Arial" w:hAnsi="Arial"/>
-                <w:i/>
-                <w:iCs/>
-                <w:color w:val="1A1A1A"/>
-                <w:sz w:val="17"/>
-                <w:szCs w:val="17"/>
-              </w:rPr>
-              <w:t xml:space="preserve">cadastrar fornecedores com dados fiscais, comerciais e de avaliação</w:t>
-            </w:r>
-            <w:r>
-              <w:rPr>
-                <w:rFonts w:ascii="Arial" w:cs="Arial" w:eastAsia="Arial" w:hAnsi="Arial"/>
-                <w:i/>
-                <w:iCs/>
-                <w:color w:val="1A1A1A"/>
-                <w:sz w:val="17"/>
-                <w:szCs w:val="17"/>
-              </w:rPr>
-              <w:t xml:space="preserve">, para </w:t>
-            </w:r>
-            <w:r>
-              <w:rPr>
-                <w:rFonts w:ascii="Arial" w:cs="Arial" w:eastAsia="Arial" w:hAnsi="Arial"/>
-                <w:i/>
-                <w:iCs/>
-                <w:color w:val="1A1A1A"/>
-                <w:sz w:val="17"/>
-                <w:szCs w:val="17"/>
-              </w:rPr>
-              <w:t xml:space="preserve">eu tenha uma base centralizada de todos os parceiros de fornecimento da fazenda</w:t>
+              <w:t>Como gerente administrativo, quero cadastrar fornecedores com dados fiscais, comerciais e de avaliação, para eu tenha uma base centralizada de todos os parceiros de fornecimento da fazenda</w:t>
             </w:r>
           </w:p>
         </w:tc>
@@ -2674,62 +2619,7 @@
                 <w:sz w:val="17"/>
                 <w:szCs w:val="17"/>
               </w:rPr>
-              <w:t xml:space="preserve">Como </w:t>
-            </w:r>
-            <w:r>
-              <w:rPr>
-                <w:rFonts w:ascii="Arial" w:cs="Arial" w:eastAsia="Arial" w:hAnsi="Arial"/>
-                <w:i/>
-                <w:iCs/>
-                <w:color w:val="1A1A1A"/>
-                <w:sz w:val="17"/>
-                <w:szCs w:val="17"/>
-              </w:rPr>
-              <w:t xml:space="preserve">gerente administrativo</w:t>
-            </w:r>
-            <w:r>
-              <w:rPr>
-                <w:rFonts w:ascii="Arial" w:cs="Arial" w:eastAsia="Arial" w:hAnsi="Arial"/>
-                <w:i/>
-                <w:iCs/>
-                <w:color w:val="1A1A1A"/>
-                <w:sz w:val="17"/>
-                <w:szCs w:val="17"/>
-              </w:rPr>
-              <w:t xml:space="preserve">, quero </w:t>
-            </w:r>
-            <w:r>
-              <w:rPr>
-                <w:rFonts w:ascii="Arial" w:cs="Arial" w:eastAsia="Arial" w:hAnsi="Arial"/>
-                <w:i/>
-                <w:iCs/>
-                <w:color w:val="1A1A1A"/>
-                <w:sz w:val="17"/>
-                <w:szCs w:val="17"/>
-              </w:rPr>
-              <w:t xml:space="preserve">importar fornecedores existentes e encontrar rapidamente qualquer um na base</w:t>
-            </w:r>
-            <w:r>
-              <w:rPr>
-                <w:rFonts w:ascii="Arial" w:cs="Arial" w:eastAsia="Arial" w:hAnsi="Arial"/>
-                <w:i/>
-                <w:iCs/>
-                <w:color w:val="1A1A1A"/>
-                <w:sz w:val="17"/>
-                <w:szCs w:val="17"/>
-              </w:rPr>
-              <w:t xml:space="preserve">, para </w:t>
-            </w:r>
-            <w:r>
-              <w:rPr>
-                <w:rFonts w:ascii="Arial" w:cs="Arial" w:eastAsia="Arial" w:hAnsi="Arial"/>
-                <w:i/>
-                <w:iCs/>
-                <w:color w:val="1A1A1A"/>
-                <w:sz w:val="17"/>
-                <w:szCs w:val="17"/>
-              </w:rPr>
-              <w:t xml:space="preserve">a migração seja rápida e o dia a dia ágil</w:t>
+              <w:t>Como gerente administrativo, quero importar fornecedores existentes e encontrar rapidamente qualquer um na base, para a migração seja rápida e o dia a dia ágil</w:t>
             </w:r>
           </w:p>
         </w:tc>
@@ -2997,62 +2887,7 @@
                 <w:sz w:val="17"/>
                 <w:szCs w:val="17"/>
               </w:rPr>
-              <w:t xml:space="preserve">Como </w:t>
-            </w:r>
-            <w:r>
-              <w:rPr>
-                <w:rFonts w:ascii="Arial" w:cs="Arial" w:eastAsia="Arial" w:hAnsi="Arial"/>
-                <w:i/>
-                <w:iCs/>
-                <w:color w:val="1A1A1A"/>
-                <w:sz w:val="17"/>
-                <w:szCs w:val="17"/>
-              </w:rPr>
-              <w:t xml:space="preserve">gerente de compras</w:t>
-            </w:r>
-            <w:r>
-              <w:rPr>
-                <w:rFonts w:ascii="Arial" w:cs="Arial" w:eastAsia="Arial" w:hAnsi="Arial"/>
-                <w:i/>
-                <w:iCs/>
-                <w:color w:val="1A1A1A"/>
-                <w:sz w:val="17"/>
-                <w:szCs w:val="17"/>
-              </w:rPr>
-              <w:t xml:space="preserve">, quero </w:t>
-            </w:r>
-            <w:r>
-              <w:rPr>
-                <w:rFonts w:ascii="Arial" w:cs="Arial" w:eastAsia="Arial" w:hAnsi="Arial"/>
-                <w:i/>
-                <w:iCs/>
-                <w:color w:val="1A1A1A"/>
-                <w:sz w:val="17"/>
-                <w:szCs w:val="17"/>
-              </w:rPr>
-              <w:t xml:space="preserve">avaliar fornecedores após cada compra e ver o ranking consolidado</w:t>
-            </w:r>
-            <w:r>
-              <w:rPr>
-                <w:rFonts w:ascii="Arial" w:cs="Arial" w:eastAsia="Arial" w:hAnsi="Arial"/>
-                <w:i/>
-                <w:iCs/>
-                <w:color w:val="1A1A1A"/>
-                <w:sz w:val="17"/>
-                <w:szCs w:val="17"/>
-              </w:rPr>
-              <w:t xml:space="preserve">, para </w:t>
-            </w:r>
-            <w:r>
-              <w:rPr>
-                <w:rFonts w:ascii="Arial" w:cs="Arial" w:eastAsia="Arial" w:hAnsi="Arial"/>
-                <w:i/>
-                <w:iCs/>
-                <w:color w:val="1A1A1A"/>
-                <w:sz w:val="17"/>
-                <w:szCs w:val="17"/>
-              </w:rPr>
-              <w:t xml:space="preserve">eu priorize os melhores fornecedores e evite os problemáticos</w:t>
+              <w:t>Como gerente de compras, quero avaliar fornecedores após cada compra e ver o ranking consolidado, para eu priorize os melhores fornecedores e evite os problemáticos</w:t>
             </w:r>
           </w:p>
         </w:tc>
@@ -3587,62 +3422,7 @@
                 <w:sz w:val="17"/>
                 <w:szCs w:val="17"/>
               </w:rPr>
-              <w:t xml:space="preserve">Como </w:t>
-            </w:r>
-            <w:r>
-              <w:rPr>
-                <w:rFonts w:ascii="Arial" w:cs="Arial" w:eastAsia="Arial" w:hAnsi="Arial"/>
-                <w:i/>
-                <w:iCs/>
-                <w:color w:val="1A1A1A"/>
-                <w:sz w:val="17"/>
-                <w:szCs w:val="17"/>
-              </w:rPr>
-              <w:t xml:space="preserve">agrônomo, gerente de campo ou gerente de manutenção</w:t>
-            </w:r>
-            <w:r>
-              <w:rPr>
-                <w:rFonts w:ascii="Arial" w:cs="Arial" w:eastAsia="Arial" w:hAnsi="Arial"/>
-                <w:i/>
-                <w:iCs/>
-                <w:color w:val="1A1A1A"/>
-                <w:sz w:val="17"/>
-                <w:szCs w:val="17"/>
-              </w:rPr>
-              <w:t xml:space="preserve">, quero </w:t>
-            </w:r>
-            <w:r>
-              <w:rPr>
-                <w:rFonts w:ascii="Arial" w:cs="Arial" w:eastAsia="Arial" w:hAnsi="Arial"/>
-                <w:i/>
-                <w:iCs/>
-                <w:color w:val="1A1A1A"/>
-                <w:sz w:val="17"/>
-                <w:szCs w:val="17"/>
-              </w:rPr>
-              <w:t xml:space="preserve">criar uma requisição formal de compra de insumos, peças ou serviços</w:t>
-            </w:r>
-            <w:r>
-              <w:rPr>
-                <w:rFonts w:ascii="Arial" w:cs="Arial" w:eastAsia="Arial" w:hAnsi="Arial"/>
-                <w:i/>
-                <w:iCs/>
-                <w:color w:val="1A1A1A"/>
-                <w:sz w:val="17"/>
-                <w:szCs w:val="17"/>
-              </w:rPr>
-              <w:t xml:space="preserve">, para </w:t>
-            </w:r>
-            <w:r>
-              <w:rPr>
-                <w:rFonts w:ascii="Arial" w:cs="Arial" w:eastAsia="Arial" w:hAnsi="Arial"/>
-                <w:i/>
-                <w:iCs/>
-                <w:color w:val="1A1A1A"/>
-                <w:sz w:val="17"/>
-                <w:szCs w:val="17"/>
-              </w:rPr>
-              <w:t xml:space="preserve">a necessidade seja documentada e encaminhada para aprovação antes de gastar</w:t>
+              <w:t>Como agrônomo, gerente de campo ou gerente de manutenção, quero criar uma requisição formal de compra de insumos, peças ou serviços, para a necessidade seja documentada e encaminhada para aprovação antes de gastar</w:t>
             </w:r>
           </w:p>
         </w:tc>
@@ -3951,62 +3731,7 @@
                 <w:sz w:val="17"/>
                 <w:szCs w:val="17"/>
               </w:rPr>
-              <w:t xml:space="preserve">Como </w:t>
-            </w:r>
-            <w:r>
-              <w:rPr>
-                <w:rFonts w:ascii="Arial" w:cs="Arial" w:eastAsia="Arial" w:hAnsi="Arial"/>
-                <w:i/>
-                <w:iCs/>
-                <w:color w:val="1A1A1A"/>
-                <w:sz w:val="17"/>
-                <w:szCs w:val="17"/>
-              </w:rPr>
-              <w:t xml:space="preserve">operador de campo ou vaqueiro</w:t>
-            </w:r>
-            <w:r>
-              <w:rPr>
-                <w:rFonts w:ascii="Arial" w:cs="Arial" w:eastAsia="Arial" w:hAnsi="Arial"/>
-                <w:i/>
-                <w:iCs/>
-                <w:color w:val="1A1A1A"/>
-                <w:sz w:val="17"/>
-                <w:szCs w:val="17"/>
-              </w:rPr>
-              <w:t xml:space="preserve">, quero </w:t>
-            </w:r>
-            <w:r>
-              <w:rPr>
-                <w:rFonts w:ascii="Arial" w:cs="Arial" w:eastAsia="Arial" w:hAnsi="Arial"/>
-                <w:i/>
-                <w:iCs/>
-                <w:color w:val="1A1A1A"/>
-                <w:sz w:val="17"/>
-                <w:szCs w:val="17"/>
-              </w:rPr>
-              <w:t xml:space="preserve">solicitar a compra de um item diretamente pelo celular quando identifico a necessidade</w:t>
-            </w:r>
-            <w:r>
-              <w:rPr>
-                <w:rFonts w:ascii="Arial" w:cs="Arial" w:eastAsia="Arial" w:hAnsi="Arial"/>
-                <w:i/>
-                <w:iCs/>
-                <w:color w:val="1A1A1A"/>
-                <w:sz w:val="17"/>
-                <w:szCs w:val="17"/>
-              </w:rPr>
-              <w:t xml:space="preserve">, para </w:t>
-            </w:r>
-            <w:r>
-              <w:rPr>
-                <w:rFonts w:ascii="Arial" w:cs="Arial" w:eastAsia="Arial" w:hAnsi="Arial"/>
-                <w:i/>
-                <w:iCs/>
-                <w:color w:val="1A1A1A"/>
-                <w:sz w:val="17"/>
-                <w:szCs w:val="17"/>
-              </w:rPr>
-              <w:t xml:space="preserve">a requisição chegue rápido ao administrativo sem eu precisar ir ao escritório</w:t>
+              <w:t>Como operador de campo ou vaqueiro, quero solicitar a compra de um item diretamente pelo celular quando identifico a necessidade, para a requisição chegue rápido ao administrativo sem eu precisar ir ao escritório</w:t>
             </w:r>
           </w:p>
         </w:tc>
@@ -4274,62 +3999,7 @@
                 <w:sz w:val="17"/>
                 <w:szCs w:val="17"/>
               </w:rPr>
-              <w:t xml:space="preserve">Como </w:t>
-            </w:r>
-            <w:r>
-              <w:rPr>
-                <w:rFonts w:ascii="Arial" w:cs="Arial" w:eastAsia="Arial" w:hAnsi="Arial"/>
-                <w:i/>
-                <w:iCs/>
-                <w:color w:val="1A1A1A"/>
-                <w:sz w:val="17"/>
-                <w:szCs w:val="17"/>
-              </w:rPr>
-              <w:t xml:space="preserve">gerente da fazenda</w:t>
-            </w:r>
-            <w:r>
-              <w:rPr>
-                <w:rFonts w:ascii="Arial" w:cs="Arial" w:eastAsia="Arial" w:hAnsi="Arial"/>
-                <w:i/>
-                <w:iCs/>
-                <w:color w:val="1A1A1A"/>
-                <w:sz w:val="17"/>
-                <w:szCs w:val="17"/>
-              </w:rPr>
-              <w:t xml:space="preserve">, quero </w:t>
-            </w:r>
-            <w:r>
-              <w:rPr>
-                <w:rFonts w:ascii="Arial" w:cs="Arial" w:eastAsia="Arial" w:hAnsi="Arial"/>
-                <w:i/>
-                <w:iCs/>
-                <w:color w:val="1A1A1A"/>
-                <w:sz w:val="17"/>
-                <w:szCs w:val="17"/>
-              </w:rPr>
-              <w:t xml:space="preserve">revisar e aprovar ou rejeitar requisições de compra</w:t>
-            </w:r>
-            <w:r>
-              <w:rPr>
-                <w:rFonts w:ascii="Arial" w:cs="Arial" w:eastAsia="Arial" w:hAnsi="Arial"/>
-                <w:i/>
-                <w:iCs/>
-                <w:color w:val="1A1A1A"/>
-                <w:sz w:val="17"/>
-                <w:szCs w:val="17"/>
-              </w:rPr>
-              <w:t xml:space="preserve">, para </w:t>
-            </w:r>
-            <w:r>
-              <w:rPr>
-                <w:rFonts w:ascii="Arial" w:cs="Arial" w:eastAsia="Arial" w:hAnsi="Arial"/>
-                <w:i/>
-                <w:iCs/>
-                <w:color w:val="1A1A1A"/>
-                <w:sz w:val="17"/>
-                <w:szCs w:val="17"/>
-              </w:rPr>
-              <w:t xml:space="preserve">nenhuma compra aconteça sem minha autorização e eu controle os gastos</w:t>
+              <w:t>Como gerente da fazenda, quero revisar e aprovar ou rejeitar requisições de compra, para nenhuma compra aconteça sem minha autorização e eu controle os gastos</w:t>
             </w:r>
           </w:p>
         </w:tc>
@@ -4892,62 +4562,7 @@
                 <w:sz w:val="17"/>
                 <w:szCs w:val="17"/>
               </w:rPr>
-              <w:t xml:space="preserve">Como </w:t>
-            </w:r>
-            <w:r>
-              <w:rPr>
-                <w:rFonts w:ascii="Arial" w:cs="Arial" w:eastAsia="Arial" w:hAnsi="Arial"/>
-                <w:i/>
-                <w:iCs/>
-                <w:color w:val="1A1A1A"/>
-                <w:sz w:val="17"/>
-                <w:szCs w:val="17"/>
-              </w:rPr>
-              <w:t xml:space="preserve">comprador ou administrativo</w:t>
-            </w:r>
-            <w:r>
-              <w:rPr>
-                <w:rFonts w:ascii="Arial" w:cs="Arial" w:eastAsia="Arial" w:hAnsi="Arial"/>
-                <w:i/>
-                <w:iCs/>
-                <w:color w:val="1A1A1A"/>
-                <w:sz w:val="17"/>
-                <w:szCs w:val="17"/>
-              </w:rPr>
-              <w:t xml:space="preserve">, quero </w:t>
-            </w:r>
-            <w:r>
-              <w:rPr>
-                <w:rFonts w:ascii="Arial" w:cs="Arial" w:eastAsia="Arial" w:hAnsi="Arial"/>
-                <w:i/>
-                <w:iCs/>
-                <w:color w:val="1A1A1A"/>
-                <w:sz w:val="17"/>
-                <w:szCs w:val="17"/>
-              </w:rPr>
-              <w:t xml:space="preserve">enviar pedidos de cotação para múltiplos fornecedores a partir da requisição aprovada</w:t>
-            </w:r>
-            <w:r>
-              <w:rPr>
-                <w:rFonts w:ascii="Arial" w:cs="Arial" w:eastAsia="Arial" w:hAnsi="Arial"/>
-                <w:i/>
-                <w:iCs/>
-                <w:color w:val="1A1A1A"/>
-                <w:sz w:val="17"/>
-                <w:szCs w:val="17"/>
-              </w:rPr>
-              <w:t xml:space="preserve">, para </w:t>
-            </w:r>
-            <w:r>
-              <w:rPr>
-                <w:rFonts w:ascii="Arial" w:cs="Arial" w:eastAsia="Arial" w:hAnsi="Arial"/>
-                <w:i/>
-                <w:iCs/>
-                <w:color w:val="1A1A1A"/>
-                <w:sz w:val="17"/>
-                <w:szCs w:val="17"/>
-              </w:rPr>
-              <w:t xml:space="preserve">eu compare preços e condições antes de decidir a compra</w:t>
+              <w:t>Como comprador ou administrativo, quero enviar pedidos de cotação para múltiplos fornecedores a partir da requisição aprovada, para eu compare preços e condições antes de decidir a compra</w:t>
             </w:r>
           </w:p>
         </w:tc>
@@ -5242,62 +4857,7 @@
                 <w:sz w:val="17"/>
                 <w:szCs w:val="17"/>
               </w:rPr>
-              <w:t xml:space="preserve">Como </w:t>
-            </w:r>
-            <w:r>
-              <w:rPr>
-                <w:rFonts w:ascii="Arial" w:cs="Arial" w:eastAsia="Arial" w:hAnsi="Arial"/>
-                <w:i/>
-                <w:iCs/>
-                <w:color w:val="1A1A1A"/>
-                <w:sz w:val="17"/>
-                <w:szCs w:val="17"/>
-              </w:rPr>
-              <w:t xml:space="preserve">comprador</w:t>
-            </w:r>
-            <w:r>
-              <w:rPr>
-                <w:rFonts w:ascii="Arial" w:cs="Arial" w:eastAsia="Arial" w:hAnsi="Arial"/>
-                <w:i/>
-                <w:iCs/>
-                <w:color w:val="1A1A1A"/>
-                <w:sz w:val="17"/>
-                <w:szCs w:val="17"/>
-              </w:rPr>
-              <w:t xml:space="preserve">, quero </w:t>
-            </w:r>
-            <w:r>
-              <w:rPr>
-                <w:rFonts w:ascii="Arial" w:cs="Arial" w:eastAsia="Arial" w:hAnsi="Arial"/>
-                <w:i/>
-                <w:iCs/>
-                <w:color w:val="1A1A1A"/>
-                <w:sz w:val="17"/>
-                <w:szCs w:val="17"/>
-              </w:rPr>
-              <w:t xml:space="preserve">registrar as cotações recebidas e compará-las lado a lado</w:t>
-            </w:r>
-            <w:r>
-              <w:rPr>
-                <w:rFonts w:ascii="Arial" w:cs="Arial" w:eastAsia="Arial" w:hAnsi="Arial"/>
-                <w:i/>
-                <w:iCs/>
-                <w:color w:val="1A1A1A"/>
-                <w:sz w:val="17"/>
-                <w:szCs w:val="17"/>
-              </w:rPr>
-              <w:t xml:space="preserve">, para </w:t>
-            </w:r>
-            <w:r>
-              <w:rPr>
-                <w:rFonts w:ascii="Arial" w:cs="Arial" w:eastAsia="Arial" w:hAnsi="Arial"/>
-                <w:i/>
-                <w:iCs/>
-                <w:color w:val="1A1A1A"/>
-                <w:sz w:val="17"/>
-                <w:szCs w:val="17"/>
-              </w:rPr>
-              <w:t xml:space="preserve">eu escolha a melhor opção de preço, prazo e condição de pagamento</w:t>
+              <w:t>Como comprador, quero registrar as cotações recebidas e compará-las lado a lado, para eu escolha a melhor opção de preço, prazo e condição de pagamento</w:t>
             </w:r>
           </w:p>
         </w:tc>
@@ -5607,62 +5167,7 @@
                 <w:sz w:val="17"/>
                 <w:szCs w:val="17"/>
               </w:rPr>
-              <w:t xml:space="preserve">Como </w:t>
-            </w:r>
-            <w:r>
-              <w:rPr>
-                <w:rFonts w:ascii="Arial" w:cs="Arial" w:eastAsia="Arial" w:hAnsi="Arial"/>
-                <w:i/>
-                <w:iCs/>
-                <w:color w:val="1A1A1A"/>
-                <w:sz w:val="17"/>
-                <w:szCs w:val="17"/>
-              </w:rPr>
-              <w:t xml:space="preserve">gerente</w:t>
-            </w:r>
-            <w:r>
-              <w:rPr>
-                <w:rFonts w:ascii="Arial" w:cs="Arial" w:eastAsia="Arial" w:hAnsi="Arial"/>
-                <w:i/>
-                <w:iCs/>
-                <w:color w:val="1A1A1A"/>
-                <w:sz w:val="17"/>
-                <w:szCs w:val="17"/>
-              </w:rPr>
-              <w:t xml:space="preserve">, quero </w:t>
-            </w:r>
-            <w:r>
-              <w:rPr>
-                <w:rFonts w:ascii="Arial" w:cs="Arial" w:eastAsia="Arial" w:hAnsi="Arial"/>
-                <w:i/>
-                <w:iCs/>
-                <w:color w:val="1A1A1A"/>
-                <w:sz w:val="17"/>
-                <w:szCs w:val="17"/>
-              </w:rPr>
-              <w:t xml:space="preserve">aprovar a cotação vencedora antes de emitir o pedido</w:t>
-            </w:r>
-            <w:r>
-              <w:rPr>
-                <w:rFonts w:ascii="Arial" w:cs="Arial" w:eastAsia="Arial" w:hAnsi="Arial"/>
-                <w:i/>
-                <w:iCs/>
-                <w:color w:val="1A1A1A"/>
-                <w:sz w:val="17"/>
-                <w:szCs w:val="17"/>
-              </w:rPr>
-              <w:t xml:space="preserve">, para </w:t>
-            </w:r>
-            <w:r>
-              <w:rPr>
-                <w:rFonts w:ascii="Arial" w:cs="Arial" w:eastAsia="Arial" w:hAnsi="Arial"/>
-                <w:i/>
-                <w:iCs/>
-                <w:color w:val="1A1A1A"/>
-                <w:sz w:val="17"/>
-                <w:szCs w:val="17"/>
-              </w:rPr>
-              <w:t xml:space="preserve">eu tenha visibilidade e controle sobre o valor final da compra</w:t>
+              <w:t>Como gerente, quero aprovar a cotação vencedora antes de emitir o pedido, para eu tenha visibilidade e controle sobre o valor final da compra</w:t>
             </w:r>
           </w:p>
         </w:tc>
@@ -6183,62 +5688,7 @@
                 <w:sz w:val="17"/>
                 <w:szCs w:val="17"/>
               </w:rPr>
-              <w:t xml:space="preserve">Como </w:t>
-            </w:r>
-            <w:r>
-              <w:rPr>
-                <w:rFonts w:ascii="Arial" w:cs="Arial" w:eastAsia="Arial" w:hAnsi="Arial"/>
-                <w:i/>
-                <w:iCs/>
-                <w:color w:val="1A1A1A"/>
-                <w:sz w:val="17"/>
-                <w:szCs w:val="17"/>
-              </w:rPr>
-              <w:t xml:space="preserve">comprador</w:t>
-            </w:r>
-            <w:r>
-              <w:rPr>
-                <w:rFonts w:ascii="Arial" w:cs="Arial" w:eastAsia="Arial" w:hAnsi="Arial"/>
-                <w:i/>
-                <w:iCs/>
-                <w:color w:val="1A1A1A"/>
-                <w:sz w:val="17"/>
-                <w:szCs w:val="17"/>
-              </w:rPr>
-              <w:t xml:space="preserve">, quero </w:t>
-            </w:r>
-            <w:r>
-              <w:rPr>
-                <w:rFonts w:ascii="Arial" w:cs="Arial" w:eastAsia="Arial" w:hAnsi="Arial"/>
-                <w:i/>
-                <w:iCs/>
-                <w:color w:val="1A1A1A"/>
-                <w:sz w:val="17"/>
-                <w:szCs w:val="17"/>
-              </w:rPr>
-              <w:t xml:space="preserve">emitir o pedido de compra formal ao fornecedor com todos os termos acordados</w:t>
-            </w:r>
-            <w:r>
-              <w:rPr>
-                <w:rFonts w:ascii="Arial" w:cs="Arial" w:eastAsia="Arial" w:hAnsi="Arial"/>
-                <w:i/>
-                <w:iCs/>
-                <w:color w:val="1A1A1A"/>
-                <w:sz w:val="17"/>
-                <w:szCs w:val="17"/>
-              </w:rPr>
-              <w:t xml:space="preserve">, para </w:t>
-            </w:r>
-            <w:r>
-              <w:rPr>
-                <w:rFonts w:ascii="Arial" w:cs="Arial" w:eastAsia="Arial" w:hAnsi="Arial"/>
-                <w:i/>
-                <w:iCs/>
-                <w:color w:val="1A1A1A"/>
-                <w:sz w:val="17"/>
-                <w:szCs w:val="17"/>
-              </w:rPr>
-              <w:t xml:space="preserve">o fornecedor tenha documento oficial para preparar e despachar o pedido</w:t>
+              <w:t>Como comprador, quero emitir o pedido de compra formal ao fornecedor com todos os termos acordados, para o fornecedor tenha documento oficial para preparar e despachar o pedido</w:t>
             </w:r>
           </w:p>
         </w:tc>
@@ -6547,62 +5997,7 @@
                 <w:sz w:val="17"/>
                 <w:szCs w:val="17"/>
               </w:rPr>
-              <w:t xml:space="preserve">Como </w:t>
-            </w:r>
-            <w:r>
-              <w:rPr>
-                <w:rFonts w:ascii="Arial" w:cs="Arial" w:eastAsia="Arial" w:hAnsi="Arial"/>
-                <w:i/>
-                <w:iCs/>
-                <w:color w:val="1A1A1A"/>
-                <w:sz w:val="17"/>
-                <w:szCs w:val="17"/>
-              </w:rPr>
-              <w:t xml:space="preserve">gerente de estoque ou conferente</w:t>
-            </w:r>
-            <w:r>
-              <w:rPr>
-                <w:rFonts w:ascii="Arial" w:cs="Arial" w:eastAsia="Arial" w:hAnsi="Arial"/>
-                <w:i/>
-                <w:iCs/>
-                <w:color w:val="1A1A1A"/>
-                <w:sz w:val="17"/>
-                <w:szCs w:val="17"/>
-              </w:rPr>
-              <w:t xml:space="preserve">, quero </w:t>
-            </w:r>
-            <w:r>
-              <w:rPr>
-                <w:rFonts w:ascii="Arial" w:cs="Arial" w:eastAsia="Arial" w:hAnsi="Arial"/>
-                <w:i/>
-                <w:iCs/>
-                <w:color w:val="1A1A1A"/>
-                <w:sz w:val="17"/>
-                <w:szCs w:val="17"/>
-              </w:rPr>
-              <w:t xml:space="preserve">registrar o recebimento físico e a NF de forma independente, permitindo que cheguem em datas diferentes e em quantidades parciais</w:t>
-            </w:r>
-            <w:r>
-              <w:rPr>
-                <w:rFonts w:ascii="Arial" w:cs="Arial" w:eastAsia="Arial" w:hAnsi="Arial"/>
-                <w:i/>
-                <w:iCs/>
-                <w:color w:val="1A1A1A"/>
-                <w:sz w:val="17"/>
-                <w:szCs w:val="17"/>
-              </w:rPr>
-              <w:t xml:space="preserve">, para </w:t>
-            </w:r>
-            <w:r>
-              <w:rPr>
-                <w:rFonts w:ascii="Arial" w:cs="Arial" w:eastAsia="Arial" w:hAnsi="Arial"/>
-                <w:i/>
-                <w:iCs/>
-                <w:color w:val="1A1A1A"/>
-                <w:sz w:val="17"/>
-                <w:szCs w:val="17"/>
-              </w:rPr>
-              <w:t xml:space="preserve">o sistema reflita a realidade operacional onde produto e nota nem sempre chegam juntos, e eu tenha controle total de cada etapa</w:t>
+              <w:t>Como gerente de estoque ou conferente, quero registrar o recebimento físico e a NF de forma independente, permitindo que cheguem em datas diferentes e em quantidades parciais, para o sistema reflita a realidade operacional onde produto e nota nem sempre chegam juntos, e eu tenha controle total de cada etapa</w:t>
             </w:r>
           </w:p>
         </w:tc>
@@ -7010,62 +6405,7 @@
                 <w:sz w:val="17"/>
                 <w:szCs w:val="17"/>
               </w:rPr>
-              <w:t xml:space="preserve">Como </w:t>
-            </w:r>
-            <w:r>
-              <w:rPr>
-                <w:rFonts w:ascii="Arial" w:cs="Arial" w:eastAsia="Arial" w:hAnsi="Arial"/>
-                <w:i/>
-                <w:iCs/>
-                <w:color w:val="1A1A1A"/>
-                <w:sz w:val="17"/>
-                <w:szCs w:val="17"/>
-              </w:rPr>
-              <w:t xml:space="preserve">gerente de estoque</w:t>
-            </w:r>
-            <w:r>
-              <w:rPr>
-                <w:rFonts w:ascii="Arial" w:cs="Arial" w:eastAsia="Arial" w:hAnsi="Arial"/>
-                <w:i/>
-                <w:iCs/>
-                <w:color w:val="1A1A1A"/>
-                <w:sz w:val="17"/>
-                <w:szCs w:val="17"/>
-              </w:rPr>
-              <w:t xml:space="preserve">, quero </w:t>
-            </w:r>
-            <w:r>
-              <w:rPr>
-                <w:rFonts w:ascii="Arial" w:cs="Arial" w:eastAsia="Arial" w:hAnsi="Arial"/>
-                <w:i/>
-                <w:iCs/>
-                <w:color w:val="1A1A1A"/>
-                <w:sz w:val="17"/>
-                <w:szCs w:val="17"/>
-              </w:rPr>
-              <w:t xml:space="preserve">registrar devoluções de produtos com defeito, vencidos ou entregues errado</w:t>
-            </w:r>
-            <w:r>
-              <w:rPr>
-                <w:rFonts w:ascii="Arial" w:cs="Arial" w:eastAsia="Arial" w:hAnsi="Arial"/>
-                <w:i/>
-                <w:iCs/>
-                <w:color w:val="1A1A1A"/>
-                <w:sz w:val="17"/>
-                <w:szCs w:val="17"/>
-              </w:rPr>
-              <w:t xml:space="preserve">, para </w:t>
-            </w:r>
-            <w:r>
-              <w:rPr>
-                <w:rFonts w:ascii="Arial" w:cs="Arial" w:eastAsia="Arial" w:hAnsi="Arial"/>
-                <w:i/>
-                <w:iCs/>
-                <w:color w:val="1A1A1A"/>
-                <w:sz w:val="17"/>
-                <w:szCs w:val="17"/>
-              </w:rPr>
-              <w:t xml:space="preserve">o estoque seja ajustado e o fornecedor seja notificado para crédito ou reposição</w:t>
+              <w:t>Como gerente de estoque, quero registrar devoluções de produtos com defeito, vencidos ou entregues errado, para o estoque seja ajustado e o fornecedor seja notificado para crédito ou reposição</w:t>
             </w:r>
           </w:p>
         </w:tc>
@@ -7614,62 +6954,7 @@
                 <w:sz w:val="17"/>
                 <w:szCs w:val="17"/>
               </w:rPr>
-              <w:t xml:space="preserve">Como </w:t>
-            </w:r>
-            <w:r>
-              <w:rPr>
-                <w:rFonts w:ascii="Arial" w:cs="Arial" w:eastAsia="Arial" w:hAnsi="Arial"/>
-                <w:i/>
-                <w:iCs/>
-                <w:color w:val="1A1A1A"/>
-                <w:sz w:val="17"/>
-                <w:szCs w:val="17"/>
-              </w:rPr>
-              <w:t xml:space="preserve">financeiro</w:t>
-            </w:r>
-            <w:r>
-              <w:rPr>
-                <w:rFonts w:ascii="Arial" w:cs="Arial" w:eastAsia="Arial" w:hAnsi="Arial"/>
-                <w:i/>
-                <w:iCs/>
-                <w:color w:val="1A1A1A"/>
-                <w:sz w:val="17"/>
-                <w:szCs w:val="17"/>
-              </w:rPr>
-              <w:t xml:space="preserve">, quero </w:t>
-            </w:r>
-            <w:r>
-              <w:rPr>
-                <w:rFonts w:ascii="Arial" w:cs="Arial" w:eastAsia="Arial" w:hAnsi="Arial"/>
-                <w:i/>
-                <w:iCs/>
-                <w:color w:val="1A1A1A"/>
-                <w:sz w:val="17"/>
-                <w:szCs w:val="17"/>
-              </w:rPr>
-              <w:t xml:space="preserve">que ao confirmar o recebimento com NF, o lançamento no contas a pagar seja gerado automaticamente, mesmo quando NF e mercadoria chegam em datas diferentes</w:t>
-            </w:r>
-            <w:r>
-              <w:rPr>
-                <w:rFonts w:ascii="Arial" w:cs="Arial" w:eastAsia="Arial" w:hAnsi="Arial"/>
-                <w:i/>
-                <w:iCs/>
-                <w:color w:val="1A1A1A"/>
-                <w:sz w:val="17"/>
-                <w:szCs w:val="17"/>
-              </w:rPr>
-              <w:t xml:space="preserve">, para </w:t>
-            </w:r>
-            <w:r>
-              <w:rPr>
-                <w:rFonts w:ascii="Arial" w:cs="Arial" w:eastAsia="Arial" w:hAnsi="Arial"/>
-                <w:i/>
-                <w:iCs/>
-                <w:color w:val="1A1A1A"/>
-                <w:sz w:val="17"/>
-                <w:szCs w:val="17"/>
-              </w:rPr>
-              <w:t xml:space="preserve">eu não precise redigitar os dados da compra no financeiro e os prazos de pagamento estejam corretos independente do cenário de recebimento</w:t>
+              <w:t>Como financeiro, quero que ao confirmar o recebimento com NF, o lançamento no contas a pagar seja gerado automaticamente, mesmo quando NF e mercadoria chegam em datas diferentes, para eu não precise redigitar os dados da compra no financeiro e os prazos de pagamento estejam corretos independente do cenário de recebimento</w:t>
             </w:r>
           </w:p>
         </w:tc>
@@ -7932,6 +7217,64 @@
               <w:t xml:space="preserve">☐ Para compras sem pedido formal (emergenciais): geração manual do lançamento com alerta de 'compra sem pedido'</w:t>
             </w:r>
           </w:p>
+          <w:p>
+            <w:pPr>
+              <w:spacing w:before="60" w:after="30"/>
+            </w:pPr>
+            <w:r>
+              <w:rPr>
+                <w:rFonts w:ascii="Arial" w:cs="Arial" w:eastAsia="Arial" w:hAnsi="Arial"/>
+                <w:b/>
+                <w:bCs/>
+                <w:color w:val="2E7D32"/>
+                <w:sz w:val="17"/>
+                <w:szCs w:val="17"/>
+              </w:rPr>
+              <w:t xml:space="preserve">Frontend / Interface:</w:t>
+            </w:r>
+          </w:p>
+          <w:p>
+            <w:pPr>
+              <w:spacing w:after="30"/>
+            </w:pPr>
+            <w:r>
+              <w:rPr>
+                <w:rFonts w:ascii="Arial" w:cs="Arial" w:eastAsia="Arial" w:hAnsi="Arial"/>
+                <w:color w:val="1A1A1A"/>
+                <w:sz w:val="17"/>
+                <w:szCs w:val="17"/>
+              </w:rPr>
+              <w:t xml:space="preserve">☐ Tela de revisão: lista de CPs gerados automaticamente com status (provisório/confirmado), filtros por fornecedor, pedido, NF</w:t>
+            </w:r>
+          </w:p>
+          <w:p>
+            <w:pPr>
+              <w:spacing w:after="30"/>
+            </w:pPr>
+            <w:r>
+              <w:rPr>
+                <w:rFonts w:ascii="Arial" w:cs="Arial" w:eastAsia="Arial" w:hAnsi="Arial"/>
+                <w:color w:val="1A1A1A"/>
+                <w:sz w:val="17"/>
+                <w:szCs w:val="17"/>
+              </w:rPr>
+              <w:t xml:space="preserve">☐ Navegação drill-down: link clicável em cada CP para rastrear cadeia completa (CP → recebimento → NF → pedido → cotação → requisição)</w:t>
+            </w:r>
+          </w:p>
+          <w:p>
+            <w:pPr>
+              <w:spacing w:after="30"/>
+            </w:pPr>
+            <w:r>
+              <w:rPr>
+                <w:rFonts w:ascii="Arial" w:cs="Arial" w:eastAsia="Arial" w:hAnsi="Arial"/>
+                <w:color w:val="1A1A1A"/>
+                <w:sz w:val="17"/>
+                <w:szCs w:val="17"/>
+              </w:rPr>
+              <w:t xml:space="preserve">☐ Para compras sem pedido formal: modal de geração manual de CP com seleção de fornecedor e itens</w:t>
+            </w:r>
+          </w:p>
         </w:tc>
       </w:tr>
       <w:tr>
@@ -8020,62 +7363,7 @@
                 <w:sz w:val="17"/>
                 <w:szCs w:val="17"/>
               </w:rPr>
-              <w:t xml:space="preserve">Como </w:t>
-            </w:r>
-            <w:r>
-              <w:rPr>
-                <w:rFonts w:ascii="Arial" w:cs="Arial" w:eastAsia="Arial" w:hAnsi="Arial"/>
-                <w:i/>
-                <w:iCs/>
-                <w:color w:val="1A1A1A"/>
-                <w:sz w:val="17"/>
-                <w:szCs w:val="17"/>
-              </w:rPr>
-              <w:t xml:space="preserve">gerente financeiro</w:t>
-            </w:r>
-            <w:r>
-              <w:rPr>
-                <w:rFonts w:ascii="Arial" w:cs="Arial" w:eastAsia="Arial" w:hAnsi="Arial"/>
-                <w:i/>
-                <w:iCs/>
-                <w:color w:val="1A1A1A"/>
-                <w:sz w:val="17"/>
-                <w:szCs w:val="17"/>
-              </w:rPr>
-              <w:t xml:space="preserve">, quero </w:t>
-            </w:r>
-            <w:r>
-              <w:rPr>
-                <w:rFonts w:ascii="Arial" w:cs="Arial" w:eastAsia="Arial" w:hAnsi="Arial"/>
-                <w:i/>
-                <w:iCs/>
-                <w:color w:val="1A1A1A"/>
-                <w:sz w:val="17"/>
-                <w:szCs w:val="17"/>
-              </w:rPr>
-              <w:t xml:space="preserve">definir orçamento de compras por categoria e período e acompanhar a execução</w:t>
-            </w:r>
-            <w:r>
-              <w:rPr>
-                <w:rFonts w:ascii="Arial" w:cs="Arial" w:eastAsia="Arial" w:hAnsi="Arial"/>
-                <w:i/>
-                <w:iCs/>
-                <w:color w:val="1A1A1A"/>
-                <w:sz w:val="17"/>
-                <w:szCs w:val="17"/>
-              </w:rPr>
-              <w:t xml:space="preserve">, para </w:t>
-            </w:r>
-            <w:r>
-              <w:rPr>
-                <w:rFonts w:ascii="Arial" w:cs="Arial" w:eastAsia="Arial" w:hAnsi="Arial"/>
-                <w:i/>
-                <w:iCs/>
-                <w:color w:val="1A1A1A"/>
-                <w:sz w:val="17"/>
-                <w:szCs w:val="17"/>
-              </w:rPr>
-              <w:t xml:space="preserve">os gastos com compras estejam dentro do planejado e eu identifique desvios a tempo</w:t>
+              <w:t>Como gerente financeiro, quero definir orçamento de compras por categoria e período e acompanhar a execução, para os gastos com compras estejam dentro do planejado e eu identifique desvios a tempo</w:t>
             </w:r>
           </w:p>
         </w:tc>
@@ -8371,62 +7659,7 @@
                 <w:sz w:val="17"/>
                 <w:szCs w:val="17"/>
               </w:rPr>
-              <w:t xml:space="preserve">Como </w:t>
-            </w:r>
-            <w:r>
-              <w:rPr>
-                <w:rFonts w:ascii="Arial" w:cs="Arial" w:eastAsia="Arial" w:hAnsi="Arial"/>
-                <w:i/>
-                <w:iCs/>
-                <w:color w:val="1A1A1A"/>
-                <w:sz w:val="17"/>
-                <w:szCs w:val="17"/>
-              </w:rPr>
-              <w:t xml:space="preserve">gerente de compras ou diretor</w:t>
-            </w:r>
-            <w:r>
-              <w:rPr>
-                <w:rFonts w:ascii="Arial" w:cs="Arial" w:eastAsia="Arial" w:hAnsi="Arial"/>
-                <w:i/>
-                <w:iCs/>
-                <w:color w:val="1A1A1A"/>
-                <w:sz w:val="17"/>
-                <w:szCs w:val="17"/>
-              </w:rPr>
-              <w:t xml:space="preserve">, quero </w:t>
-            </w:r>
-            <w:r>
-              <w:rPr>
-                <w:rFonts w:ascii="Arial" w:cs="Arial" w:eastAsia="Arial" w:hAnsi="Arial"/>
-                <w:i/>
-                <w:iCs/>
-                <w:color w:val="1A1A1A"/>
-                <w:sz w:val="17"/>
-                <w:szCs w:val="17"/>
-              </w:rPr>
-              <w:t xml:space="preserve">ver quanto estou economizando com cotações e como os preços evoluem</w:t>
-            </w:r>
-            <w:r>
-              <w:rPr>
-                <w:rFonts w:ascii="Arial" w:cs="Arial" w:eastAsia="Arial" w:hAnsi="Arial"/>
-                <w:i/>
-                <w:iCs/>
-                <w:color w:val="1A1A1A"/>
-                <w:sz w:val="17"/>
-                <w:szCs w:val="17"/>
-              </w:rPr>
-              <w:t xml:space="preserve">, para </w:t>
-            </w:r>
-            <w:r>
-              <w:rPr>
-                <w:rFonts w:ascii="Arial" w:cs="Arial" w:eastAsia="Arial" w:hAnsi="Arial"/>
-                <w:i/>
-                <w:iCs/>
-                <w:color w:val="1A1A1A"/>
-                <w:sz w:val="17"/>
-                <w:szCs w:val="17"/>
-              </w:rPr>
-              <w:t xml:space="preserve">eu meça a eficiência do processo de compras e negocie melhor</w:t>
+              <w:t>Como gerente de compras ou diretor, quero ver quanto estou economizando com cotações e como os preços evoluem, para eu meça a eficiência do processo de compras e negocie melhor</w:t>
             </w:r>
           </w:p>
         </w:tc>
@@ -8961,62 +8194,7 @@
                 <w:sz w:val="17"/>
                 <w:szCs w:val="17"/>
               </w:rPr>
-              <w:t xml:space="preserve">Como </w:t>
-            </w:r>
-            <w:r>
-              <w:rPr>
-                <w:rFonts w:ascii="Arial" w:cs="Arial" w:eastAsia="Arial" w:hAnsi="Arial"/>
-                <w:i/>
-                <w:iCs/>
-                <w:color w:val="1A1A1A"/>
-                <w:sz w:val="17"/>
-                <w:szCs w:val="17"/>
-              </w:rPr>
-              <w:t xml:space="preserve">comprador ou gerente</w:t>
-            </w:r>
-            <w:r>
-              <w:rPr>
-                <w:rFonts w:ascii="Arial" w:cs="Arial" w:eastAsia="Arial" w:hAnsi="Arial"/>
-                <w:i/>
-                <w:iCs/>
-                <w:color w:val="1A1A1A"/>
-                <w:sz w:val="17"/>
-                <w:szCs w:val="17"/>
-              </w:rPr>
-              <w:t xml:space="preserve">, quero </w:t>
-            </w:r>
-            <w:r>
-              <w:rPr>
-                <w:rFonts w:ascii="Arial" w:cs="Arial" w:eastAsia="Arial" w:hAnsi="Arial"/>
-                <w:i/>
-                <w:iCs/>
-                <w:color w:val="1A1A1A"/>
-                <w:sz w:val="17"/>
-                <w:szCs w:val="17"/>
-              </w:rPr>
-              <w:t xml:space="preserve">ver o status de todas as compras em um painel kanban</w:t>
-            </w:r>
-            <w:r>
-              <w:rPr>
-                <w:rFonts w:ascii="Arial" w:cs="Arial" w:eastAsia="Arial" w:hAnsi="Arial"/>
-                <w:i/>
-                <w:iCs/>
-                <w:color w:val="1A1A1A"/>
-                <w:sz w:val="17"/>
-                <w:szCs w:val="17"/>
-              </w:rPr>
-              <w:t xml:space="preserve">, para </w:t>
-            </w:r>
-            <w:r>
-              <w:rPr>
-                <w:rFonts w:ascii="Arial" w:cs="Arial" w:eastAsia="Arial" w:hAnsi="Arial"/>
-                <w:i/>
-                <w:iCs/>
-                <w:color w:val="1A1A1A"/>
-                <w:sz w:val="17"/>
-                <w:szCs w:val="17"/>
-              </w:rPr>
-              <w:t xml:space="preserve">eu saiba em que etapa cada compra está e identifique gargalos</w:t>
+              <w:t>Como comprador ou gerente, quero ver o status de todas as compras em um painel kanban, para eu saiba em que etapa cada compra está e identifique gargalos</w:t>
             </w:r>
           </w:p>
         </w:tc>
@@ -9297,62 +8475,7 @@
                 <w:sz w:val="17"/>
                 <w:szCs w:val="17"/>
               </w:rPr>
-              <w:t xml:space="preserve">Como </w:t>
-            </w:r>
-            <w:r>
-              <w:rPr>
-                <w:rFonts w:ascii="Arial" w:cs="Arial" w:eastAsia="Arial" w:hAnsi="Arial"/>
-                <w:i/>
-                <w:iCs/>
-                <w:color w:val="1A1A1A"/>
-                <w:sz w:val="17"/>
-                <w:szCs w:val="17"/>
-              </w:rPr>
-              <w:t xml:space="preserve">gerente ou diretor</w:t>
-            </w:r>
-            <w:r>
-              <w:rPr>
-                <w:rFonts w:ascii="Arial" w:cs="Arial" w:eastAsia="Arial" w:hAnsi="Arial"/>
-                <w:i/>
-                <w:iCs/>
-                <w:color w:val="1A1A1A"/>
-                <w:sz w:val="17"/>
-                <w:szCs w:val="17"/>
-              </w:rPr>
-              <w:t xml:space="preserve">, quero </w:t>
-            </w:r>
-            <w:r>
-              <w:rPr>
-                <w:rFonts w:ascii="Arial" w:cs="Arial" w:eastAsia="Arial" w:hAnsi="Arial"/>
-                <w:i/>
-                <w:iCs/>
-                <w:color w:val="1A1A1A"/>
-                <w:sz w:val="17"/>
-                <w:szCs w:val="17"/>
-              </w:rPr>
-              <w:t xml:space="preserve">ter uma visão consolidada de todas as compras da fazenda</w:t>
-            </w:r>
-            <w:r>
-              <w:rPr>
-                <w:rFonts w:ascii="Arial" w:cs="Arial" w:eastAsia="Arial" w:hAnsi="Arial"/>
-                <w:i/>
-                <w:iCs/>
-                <w:color w:val="1A1A1A"/>
-                <w:sz w:val="17"/>
-                <w:szCs w:val="17"/>
-              </w:rPr>
-              <w:t xml:space="preserve">, para </w:t>
-            </w:r>
-            <w:r>
-              <w:rPr>
-                <w:rFonts w:ascii="Arial" w:cs="Arial" w:eastAsia="Arial" w:hAnsi="Arial"/>
-                <w:i/>
-                <w:iCs/>
-                <w:color w:val="1A1A1A"/>
-                <w:sz w:val="17"/>
-                <w:szCs w:val="17"/>
-              </w:rPr>
-              <w:t xml:space="preserve">eu acompanhe gastos, eficiência e tome decisões estratégicas de suprimentos</w:t>
+              <w:t>Como gerente ou diretor, quero ter uma visão consolidada de todas as compras da fazenda, para eu acompanhe gastos, eficiência e tome decisões estratégicas de suprimentos</w:t>
             </w:r>
           </w:p>
         </w:tc>
@@ -9648,62 +8771,7 @@
                 <w:sz w:val="17"/>
                 <w:szCs w:val="17"/>
               </w:rPr>
-              <w:t xml:space="preserve">Como </w:t>
-            </w:r>
-            <w:r>
-              <w:rPr>
-                <w:rFonts w:ascii="Arial" w:cs="Arial" w:eastAsia="Arial" w:hAnsi="Arial"/>
-                <w:i/>
-                <w:iCs/>
-                <w:color w:val="1A1A1A"/>
-                <w:sz w:val="17"/>
-                <w:szCs w:val="17"/>
-              </w:rPr>
-              <w:t xml:space="preserve">participante do processo de compras</w:t>
-            </w:r>
-            <w:r>
-              <w:rPr>
-                <w:rFonts w:ascii="Arial" w:cs="Arial" w:eastAsia="Arial" w:hAnsi="Arial"/>
-                <w:i/>
-                <w:iCs/>
-                <w:color w:val="1A1A1A"/>
-                <w:sz w:val="17"/>
-                <w:szCs w:val="17"/>
-              </w:rPr>
-              <w:t xml:space="preserve">, quero </w:t>
-            </w:r>
-            <w:r>
-              <w:rPr>
-                <w:rFonts w:ascii="Arial" w:cs="Arial" w:eastAsia="Arial" w:hAnsi="Arial"/>
-                <w:i/>
-                <w:iCs/>
-                <w:color w:val="1A1A1A"/>
-                <w:sz w:val="17"/>
-                <w:szCs w:val="17"/>
-              </w:rPr>
-              <w:t xml:space="preserve">receber notificações em cada etapa relevante</w:t>
-            </w:r>
-            <w:r>
-              <w:rPr>
-                <w:rFonts w:ascii="Arial" w:cs="Arial" w:eastAsia="Arial" w:hAnsi="Arial"/>
-                <w:i/>
-                <w:iCs/>
-                <w:color w:val="1A1A1A"/>
-                <w:sz w:val="17"/>
-                <w:szCs w:val="17"/>
-              </w:rPr>
-              <w:t xml:space="preserve">, para </w:t>
-            </w:r>
-            <w:r>
-              <w:rPr>
-                <w:rFonts w:ascii="Arial" w:cs="Arial" w:eastAsia="Arial" w:hAnsi="Arial"/>
-                <w:i/>
-                <w:iCs/>
-                <w:color w:val="1A1A1A"/>
-                <w:sz w:val="17"/>
-                <w:szCs w:val="17"/>
-              </w:rPr>
-              <w:t xml:space="preserve">eu não perca prazos e o fluxo não trave por falta de ação</w:t>
+              <w:t>Como participante do processo de compras, quero receber notificações em cada etapa relevante, para eu não perca prazos e o fluxo não trave por falta de ação</w:t>
             </w:r>
           </w:p>
         </w:tc>

</xml_diff>